<commit_message>
Add CSS class to OOXML style mapping in HtmlToOoxmlConverter
- Map MsoTitle, MsoTitle2, MsoSubtitle → Title, Title2, Subtitle
- Map MsoHeading1-6 → Heading1-6
- Map MsoToc1-9 → TOC1-9
- Map MsoTocHeading, MsoBibliography, MsoNoSpacing, SectionTitle
- Update MHT/DOCX transformation section in TODO.index.md
</commit_message>
<xml_diff>
--- a/examples/demo_formal_integral_roundtrip_spec.docx
+++ b/examples/demo_formal_integral_roundtrip_spec.docx
@@ -1,6 +1,6 @@
 
 <file path=word/document.xml><?xml version="1.0" encoding="utf-8"?>
-<w:document xmlns:w="http://schemas.openxmlformats.org/wordprocessingml/2006/main" xmlns:w14="http://schemas.microsoft.com/office/word/2010/wordml">
+<w:document xmlns:w="http://schemas.openxmlformats.org/wordprocessingml/2006/main" xmlns:r="http://schemas.openxmlformats.org/officeDocument/2006/relationships" xmlns:w14="http://schemas.microsoft.com/office/word/2010/wordml">
   <w:body>
     <w:p>
       <w:pPr>
@@ -4352,8 +4352,16 @@
 </w:document>
 </file>
 
+<file path=word/endnotes.xml><?xml version="1.0" encoding="utf-8"?>
+<w:endnotes xmlns:w="http://schemas.openxmlformats.org/wordprocessingml/2006/main"/>
+</file>
+
+<file path=word/footnotes.xml><?xml version="1.0" encoding="utf-8"?>
+<w:footnotes xmlns:w="http://schemas.openxmlformats.org/wordprocessingml/2006/main"/>
+</file>
+
 <file path=word/numbering.xml><?xml version="1.0" encoding="utf-8"?>
-<w:numbering xmlns:w="http://schemas.openxmlformats.org/wordprocessingml/2006/main" xmlns:mc="http://schemas.openxmlformats.org/markup-compatibility/2006" xmlns:wpc="http://schemas.microsoft.com/office/word/2010/wordprocessingCanvas" xmlns:cx="http://schemas.microsoft.com/office/drawing/2014/chartex" xmlns:cx1="http://schemas.microsoft.com/office/drawing/2015/9/8/chartex" xmlns:cx2="http://schemas.microsoft.com/office/drawing/2015/10/21/chartex" xmlns:cx3="http://schemas.microsoft.com/office/drawing/2016/5/9/chartex" xmlns:cx4="http://schemas.microsoft.com/office/drawing/2016/5/10/chartex" xmlns:cx5="http://schemas.microsoft.com/office/drawing/2016/5/11/chartex" xmlns:cx6="http://schemas.microsoft.com/office/drawing/2016/5/12/chartex" xmlns:cx7="http://schemas.microsoft.com/office/drawing/2016/5/13/chartex" xmlns:cx8="http://schemas.microsoft.com/office/drawing/2016/5/14/chartex" xmlns:aink="http://schemas.microsoft.com/office/drawing/2016/ink" xmlns:am3d="http://schemas.microsoft.com/office/drawing/2017/model3d" xmlns:o="urn:schemas-microsoft-com:office:office" xmlns:oel="http://schemas.microsoft.com/office/2019/extlst" xmlns:r="http://schemas.openxmlformats.org/officeDocument/2006/relationships" xmlns:m="http://schemas.openxmlformats.org/officeDocument/2006/math" xmlns:v="urn:schemas-microsoft-com:vml" xmlns:wp14="http://schemas.microsoft.com/office/word/2010/wordprocessingDrawing" xmlns:wp="http://schemas.openxmlformats.org/drawingml/2006/wordprocessingDrawing" xmlns:w10="urn:schemas-microsoft-com:office:word" xmlns:w14="http://schemas.microsoft.com/office/word/2010/wordml" xmlns:w16cex="http://schemas.microsoft.com/office/word/2018/wordml/cex" xmlns:w16="http://schemas.microsoft.com/office/word/2018/wordml" xmlns:w16du="http://schemas.microsoft.com/office/word/2023/wordml/word16du" xmlns:w16sdtdh="http://schemas.microsoft.com/office/word/2020/wordml/sdtdatahash" xmlns:w16sdtfl="http://schemas.microsoft.com/office/word/2024/wordml/sdtformatlock" xmlns:w16se="http://schemas.microsoft.com/office/word/2015/wordml/symex" xmlns:wpg="http://schemas.microsoft.com/office/word/2010/wordprocessingGroup" xmlns:wpi="http://schemas.microsoft.com/office/word/2010/wordprocessingInk" xmlns:wne="http://schemas.microsoft.com/office/word/2006/wordml" xmlns:wps="http://schemas.microsoft.com/office/word/2010/wordprocessingShape" mc:Ignorable="w14 w15 w16se w16cid w16 w16cex w16sdtdh w16sdtfl w16du wp14">
+<w:numbering xmlns:w="http://schemas.openxmlformats.org/wordprocessingml/2006/main" xmlns:mc="http://schemas.openxmlformats.org/markup-compatibility/2006" mc:Ignorable="w14 w15 w16se w16cid w16 w16cex w16sdtdh w16sdtfl w16du wp14">
   <w:abstractNum xmlns:w15="http://schemas.microsoft.com/office/word/2012/wordml" w:abstractNumId="0" w15:restartNumberingAfterBreak="0">
     <w:nsid w:val="FFFFFF89"/>
     <w:multiLevelType w:val="singleLevel"/>
@@ -4382,7 +4390,7 @@
 </file>
 
 <file path=word/styles.xml><?xml version="1.0" encoding="utf-8"?>
-<w:styles xmlns:w="http://schemas.openxmlformats.org/wordprocessingml/2006/main" xmlns:mc="http://schemas.openxmlformats.org/markup-compatibility/2006" xmlns:r="http://schemas.openxmlformats.org/officeDocument/2006/relationships" xmlns:w14="http://schemas.microsoft.com/office/word/2010/wordml" xmlns:w15="http://schemas.microsoft.com/office/word/2012/wordml" xmlns:w16cex="http://schemas.microsoft.com/office/word/2018/wordml/cex" xmlns:w16cid="http://schemas.microsoft.com/office/word/2016/wordml/cid" xmlns:w16="http://schemas.microsoft.com/office/word/2018/wordml" xmlns:w16du="http://schemas.microsoft.com/office/word/2023/wordml/word16du" xmlns:w16sdtdh="http://schemas.microsoft.com/office/word/2020/wordml/sdtdatahash" xmlns:w16sdtfl="http://schemas.microsoft.com/office/word/2024/wordml/sdtformatlock" xmlns:w16se="http://schemas.microsoft.com/office/word/2015/wordml/symex" mc:Ignorable="w14 w15 w16se w16cid w16 w16cex w16sdtdh w16sdtfl w16du">
+<w:styles xmlns:w="http://schemas.openxmlformats.org/wordprocessingml/2006/main" xmlns:mc="http://schemas.openxmlformats.org/markup-compatibility/2006" mc:Ignorable="w14 w15 w16se w16cid w16 w16cex w16sdtdh w16sdtfl w16du">
   <w:docDefaults>
     <w:rPrDefault>
       <w:rPr>
@@ -4781,7 +4789,7 @@
     <w:qFormat/>
     <w:rsid w:val="005F0FA3"/>
   </w:style>
-  <w:style w:type="paragraph" w:styleId="Heading1" w:default="0">
+  <w:style w:type="paragraph" w:styleId="Heading1">
     <w:name w:val="heading 1"/>
     <w:basedOn w:val="Normal"/>
     <w:next w:val="Normal"/>
@@ -4805,7 +4813,7 @@
       <w:szCs w:val="28"/>
     </w:rPr>
   </w:style>
-  <w:style w:type="paragraph" w:styleId="Heading2" w:default="0">
+  <w:style w:type="paragraph" w:styleId="Heading2">
     <w:name w:val="heading 2"/>
     <w:basedOn w:val="Normal"/>
     <w:next w:val="Normal"/>
@@ -4830,7 +4838,7 @@
       <w:szCs w:val="24"/>
     </w:rPr>
   </w:style>
-  <w:style w:type="paragraph" w:styleId="Heading3" w:default="0">
+  <w:style w:type="paragraph" w:styleId="Heading3">
     <w:name w:val="heading 3"/>
     <w:basedOn w:val="Normal"/>
     <w:next w:val="Normal"/>
@@ -4855,7 +4863,7 @@
       <w:szCs w:val="24"/>
     </w:rPr>
   </w:style>
-  <w:style w:type="paragraph" w:styleId="Heading4" w:default="0">
+  <w:style w:type="paragraph" w:styleId="Heading4">
     <w:name w:val="heading 4"/>
     <w:basedOn w:val="Normal"/>
     <w:next w:val="Normal"/>
@@ -4879,7 +4887,7 @@
       <w:spacing w:val="10"/>
     </w:rPr>
   </w:style>
-  <w:style w:type="paragraph" w:styleId="Heading5" w:default="0">
+  <w:style w:type="paragraph" w:styleId="Heading5">
     <w:name w:val="heading 5"/>
     <w:basedOn w:val="Normal"/>
     <w:next w:val="Normal"/>
@@ -4900,7 +4908,7 @@
       <w:spacing w:val="10"/>
     </w:rPr>
   </w:style>
-  <w:style w:type="paragraph" w:styleId="Heading6" w:default="0">
+  <w:style w:type="paragraph" w:styleId="Heading6">
     <w:name w:val="heading 6"/>
     <w:basedOn w:val="Normal"/>
     <w:next w:val="Normal"/>
@@ -4921,7 +4929,7 @@
       <w:spacing w:val="10"/>
     </w:rPr>
   </w:style>
-  <w:style w:type="paragraph" w:styleId="Heading7" w:default="0">
+  <w:style w:type="paragraph" w:styleId="Heading7">
     <w:name w:val="heading 7"/>
     <w:basedOn w:val="Normal"/>
     <w:next w:val="Normal"/>
@@ -4944,7 +4952,7 @@
       <w:spacing w:val="10"/>
     </w:rPr>
   </w:style>
-  <w:style w:type="paragraph" w:styleId="Heading8" w:default="0">
+  <w:style w:type="paragraph" w:styleId="Heading8">
     <w:name w:val="heading 8"/>
     <w:basedOn w:val="Normal"/>
     <w:next w:val="Normal"/>
@@ -4966,7 +4974,7 @@
       <w:szCs w:val="20"/>
     </w:rPr>
   </w:style>
-  <w:style w:type="paragraph" w:styleId="Heading9" w:default="0">
+  <w:style w:type="paragraph" w:styleId="Heading9">
     <w:name w:val="heading 9"/>
     <w:basedOn w:val="Normal"/>
     <w:next w:val="Normal"/>
@@ -5016,7 +5024,7 @@
     <w:semiHidden/>
     <w:unhideWhenUsed/>
   </w:style>
-  <w:style w:type="character" w:styleId="Heading1Char" w:default="0" w:customStyle="1">
+  <w:style w:type="character" w:styleId="Heading1Char" w:customStyle="1">
     <w:name w:val="Heading 1 Char"/>
     <w:basedOn w:val="DefaultParagraphFont"/>
     <w:link w:val="Heading1"/>
@@ -5030,7 +5038,7 @@
       <w:szCs w:val="28"/>
     </w:rPr>
   </w:style>
-  <w:style w:type="character" w:styleId="Heading2Char" w:default="0" w:customStyle="1">
+  <w:style w:type="character" w:styleId="Heading2Char" w:customStyle="1">
     <w:name w:val="Heading 2 Char"/>
     <w:basedOn w:val="DefaultParagraphFont"/>
     <w:link w:val="Heading2"/>
@@ -5044,7 +5052,7 @@
       <w:szCs w:val="24"/>
     </w:rPr>
   </w:style>
-  <w:style w:type="character" w:styleId="Heading3Char" w:default="0" w:customStyle="1">
+  <w:style w:type="character" w:styleId="Heading3Char" w:customStyle="1">
     <w:name w:val="Heading 3 Char"/>
     <w:basedOn w:val="DefaultParagraphFont"/>
     <w:link w:val="Heading3"/>
@@ -5057,7 +5065,7 @@
       <w:szCs w:val="24"/>
     </w:rPr>
   </w:style>
-  <w:style w:type="character" w:styleId="Heading4Char" w:default="0" w:customStyle="1">
+  <w:style w:type="character" w:styleId="Heading4Char" w:customStyle="1">
     <w:name w:val="Heading 4 Char"/>
     <w:basedOn w:val="DefaultParagraphFont"/>
     <w:link w:val="Heading4"/>
@@ -5070,7 +5078,7 @@
       <w:spacing w:val="10"/>
     </w:rPr>
   </w:style>
-  <w:style w:type="character" w:styleId="Heading5Char" w:default="0" w:customStyle="1">
+  <w:style w:type="character" w:styleId="Heading5Char" w:customStyle="1">
     <w:name w:val="Heading 5 Char"/>
     <w:basedOn w:val="DefaultParagraphFont"/>
     <w:link w:val="Heading5"/>
@@ -5083,7 +5091,7 @@
       <w:spacing w:val="10"/>
     </w:rPr>
   </w:style>
-  <w:style w:type="character" w:styleId="Heading6Char" w:default="0" w:customStyle="1">
+  <w:style w:type="character" w:styleId="Heading6Char" w:customStyle="1">
     <w:name w:val="Heading 6 Char"/>
     <w:basedOn w:val="DefaultParagraphFont"/>
     <w:link w:val="Heading6"/>
@@ -5096,7 +5104,7 @@
       <w:spacing w:val="10"/>
     </w:rPr>
   </w:style>
-  <w:style w:type="character" w:styleId="Heading7Char" w:default="0" w:customStyle="1">
+  <w:style w:type="character" w:styleId="Heading7Char" w:customStyle="1">
     <w:name w:val="Heading 7 Char"/>
     <w:basedOn w:val="DefaultParagraphFont"/>
     <w:link w:val="Heading7"/>
@@ -5111,7 +5119,7 @@
       <w:spacing w:val="10"/>
     </w:rPr>
   </w:style>
-  <w:style w:type="character" w:styleId="Heading8Char" w:default="0" w:customStyle="1">
+  <w:style w:type="character" w:styleId="Heading8Char" w:customStyle="1">
     <w:name w:val="Heading 8 Char"/>
     <w:basedOn w:val="DefaultParagraphFont"/>
     <w:link w:val="Heading8"/>
@@ -5125,7 +5133,7 @@
       <w:szCs w:val="20"/>
     </w:rPr>
   </w:style>
-  <w:style w:type="character" w:styleId="Heading9Char" w:default="0" w:customStyle="1">
+  <w:style w:type="character" w:styleId="Heading9Char" w:customStyle="1">
     <w:name w:val="Heading 9 Char"/>
     <w:basedOn w:val="DefaultParagraphFont"/>
     <w:link w:val="Heading9"/>
@@ -5141,7 +5149,7 @@
       <w:szCs w:val="20"/>
     </w:rPr>
   </w:style>
-  <w:style w:type="paragraph" w:styleId="Title" w:default="0">
+  <w:style w:type="paragraph" w:styleId="Title">
     <w:name w:val="Title"/>
     <w:basedOn w:val="Normal"/>
     <w:next w:val="Normal"/>
@@ -5165,7 +5173,7 @@
       <w:szCs w:val="44"/>
     </w:rPr>
   </w:style>
-  <w:style w:type="character" w:styleId="TitleChar" w:default="0" w:customStyle="1">
+  <w:style w:type="character" w:styleId="TitleChar" w:customStyle="1">
     <w:name w:val="Title Char"/>
     <w:basedOn w:val="DefaultParagraphFont"/>
     <w:link w:val="Title"/>
@@ -5179,7 +5187,7 @@
       <w:szCs w:val="44"/>
     </w:rPr>
   </w:style>
-  <w:style w:type="paragraph" w:styleId="Subtitle" w:default="0">
+  <w:style w:type="paragraph" w:styleId="Subtitle">
     <w:name w:val="Subtitle"/>
     <w:basedOn w:val="Normal"/>
     <w:next w:val="Normal"/>
@@ -5198,7 +5206,7 @@
       <w:szCs w:val="18"/>
     </w:rPr>
   </w:style>
-  <w:style w:type="character" w:styleId="SubtitleChar" w:default="0" w:customStyle="1">
+  <w:style w:type="character" w:styleId="SubtitleChar" w:customStyle="1">
     <w:name w:val="Subtitle Char"/>
     <w:basedOn w:val="DefaultParagraphFont"/>
     <w:link w:val="Subtitle"/>
@@ -5211,7 +5219,7 @@
       <w:szCs w:val="18"/>
     </w:rPr>
   </w:style>
-  <w:style w:type="paragraph" w:styleId="Quote" w:default="0">
+  <w:style w:type="paragraph" w:styleId="Quote">
     <w:name w:val="Quote"/>
     <w:basedOn w:val="Normal"/>
     <w:next w:val="Normal"/>
@@ -5224,7 +5232,7 @@
       <w:iCs/>
     </w:rPr>
   </w:style>
-  <w:style w:type="character" w:styleId="QuoteChar" w:default="0" w:customStyle="1">
+  <w:style w:type="character" w:styleId="QuoteChar" w:customStyle="1">
     <w:name w:val="Quote Char"/>
     <w:basedOn w:val="DefaultParagraphFont"/>
     <w:link w:val="Quote"/>
@@ -5235,7 +5243,7 @@
       <w:iCs/>
     </w:rPr>
   </w:style>
-  <w:style w:type="paragraph" w:styleId="ListParagraph" w:default="0">
+  <w:style w:type="paragraph" w:styleId="ListParagraph">
     <w:name w:val="List Paragraph"/>
     <w:basedOn w:val="Normal"/>
     <w:uiPriority w:val="34"/>
@@ -5246,7 +5254,7 @@
       <w:contextualSpacing/>
     </w:pPr>
   </w:style>
-  <w:style w:type="character" w:styleId="IntenseEmphasis" w:default="0">
+  <w:style w:type="character" w:styleId="IntenseEmphasis">
     <w:name w:val="Intense Emphasis"/>
     <w:uiPriority w:val="21"/>
     <w:qFormat/>
@@ -5260,7 +5268,7 @@
       <w:szCs w:val="20"/>
     </w:rPr>
   </w:style>
-  <w:style w:type="paragraph" w:styleId="IntenseQuote" w:default="0">
+  <w:style w:type="paragraph" w:styleId="IntenseQuote">
     <w:name w:val="Intense Quote"/>
     <w:basedOn w:val="Normal"/>
     <w:next w:val="Normal"/>
@@ -5284,7 +5292,7 @@
       <w:szCs w:val="20"/>
     </w:rPr>
   </w:style>
-  <w:style w:type="character" w:styleId="IntenseQuoteChar" w:default="0" w:customStyle="1">
+  <w:style w:type="character" w:styleId="IntenseQuoteChar" w:customStyle="1">
     <w:name w:val="Intense Quote Char"/>
     <w:basedOn w:val="DefaultParagraphFont"/>
     <w:link w:val="IntenseQuote"/>
@@ -5298,7 +5306,7 @@
       <w:szCs w:val="20"/>
     </w:rPr>
   </w:style>
-  <w:style w:type="character" w:styleId="IntenseReference" w:default="0">
+  <w:style w:type="character" w:styleId="IntenseReference">
     <w:name w:val="Intense Reference"/>
     <w:uiPriority w:val="32"/>
     <w:qFormat/>
@@ -5312,7 +5320,7 @@
       <w:color w:val="134162" w:themeColor="accent2" w:themeShade="7F"/>
     </w:rPr>
   </w:style>
-  <w:style w:type="paragraph" w:styleId="Caption" w:default="0">
+  <w:style w:type="paragraph" w:styleId="Caption">
     <w:name w:val="caption"/>
     <w:basedOn w:val="Normal"/>
     <w:next w:val="Normal"/>
@@ -5328,7 +5336,7 @@
       <w:szCs w:val="18"/>
     </w:rPr>
   </w:style>
-  <w:style w:type="character" w:styleId="Strong" w:default="0">
+  <w:style w:type="character" w:styleId="Strong">
     <w:name w:val="Strong"/>
     <w:uiPriority w:val="22"/>
     <w:qFormat/>
@@ -5340,7 +5348,7 @@
       <w:spacing w:val="5"/>
     </w:rPr>
   </w:style>
-  <w:style w:type="character" w:styleId="Emphasis" w:default="0">
+  <w:style w:type="character" w:styleId="Emphasis">
     <w:name w:val="Emphasis"/>
     <w:uiPriority w:val="20"/>
     <w:qFormat/>
@@ -5352,7 +5360,7 @@
       <w:szCs w:val="20"/>
     </w:rPr>
   </w:style>
-  <w:style w:type="paragraph" w:styleId="NoSpacing" w:default="0">
+  <w:style w:type="paragraph" w:styleId="NoSpacing">
     <w:name w:val="No Spacing"/>
     <w:basedOn w:val="Normal"/>
     <w:link w:val="NoSpacingChar"/>
@@ -5363,14 +5371,14 @@
       <w:spacing w:after="0" w:line="240" w:lineRule="auto"/>
     </w:pPr>
   </w:style>
-  <w:style w:type="character" w:styleId="NoSpacingChar" w:default="0" w:customStyle="1">
+  <w:style w:type="character" w:styleId="NoSpacingChar" w:customStyle="1">
     <w:name w:val="No Spacing Char"/>
     <w:basedOn w:val="DefaultParagraphFont"/>
     <w:link w:val="NoSpacing"/>
     <w:uiPriority w:val="1"/>
     <w:rsid w:val="005F0FA3"/>
   </w:style>
-  <w:style w:type="character" w:styleId="SubtleEmphasis" w:default="0">
+  <w:style w:type="character" w:styleId="SubtleEmphasis">
     <w:name w:val="Subtle Emphasis"/>
     <w:uiPriority w:val="19"/>
     <w:qFormat/>
@@ -5380,7 +5388,7 @@
       <w:iCs/>
     </w:rPr>
   </w:style>
-  <w:style w:type="character" w:styleId="SubtleReference" w:default="0">
+  <w:style w:type="character" w:styleId="SubtleReference">
     <w:name w:val="Subtle Reference"/>
     <w:basedOn w:val="DefaultParagraphFont"/>
     <w:uiPriority w:val="31"/>
@@ -5393,7 +5401,7 @@
       <w:color w:val="134162" w:themeColor="accent2" w:themeShade="7F"/>
     </w:rPr>
   </w:style>
-  <w:style w:type="character" w:styleId="BookTitle" w:default="0">
+  <w:style w:type="character" w:styleId="BookTitle">
     <w:name w:val="Book Title"/>
     <w:uiPriority w:val="33"/>
     <w:qFormat/>
@@ -5405,7 +5413,7 @@
       <w:u w:color="134162" w:themeColor="accent2" w:themeShade="7F"/>
     </w:rPr>
   </w:style>
-  <w:style w:type="paragraph" w:styleId="TOCHeading" w:default="0">
+  <w:style w:type="paragraph" w:styleId="TOCHeading">
     <w:name w:val="TOC Heading"/>
     <w:basedOn w:val="Heading1"/>
     <w:next w:val="Normal"/>
@@ -5418,7 +5426,7 @@
       <w:outlineLvl w:val="9"/>
     </w:pPr>
   </w:style>
-  <w:style w:type="paragraph" w:styleId="Date" w:default="0">
+  <w:style w:type="paragraph" w:styleId="Date">
     <w:name w:val="Date"/>
     <w:basedOn w:val="Normal"/>
     <w:next w:val="Normal"/>
@@ -5427,14 +5435,14 @@
     <w:unhideWhenUsed/>
     <w:rsid w:val="005F0FA3"/>
   </w:style>
-  <w:style w:type="character" w:styleId="DateChar" w:default="0" w:customStyle="1">
+  <w:style w:type="character" w:styleId="DateChar" w:customStyle="1">
     <w:name w:val="Date Char"/>
     <w:basedOn w:val="DefaultParagraphFont"/>
     <w:link w:val="Date"/>
     <w:uiPriority w:val="99"/>
     <w:rsid w:val="005F0FA3"/>
   </w:style>
-  <w:style w:type="paragraph" w:styleId="ListBullet" w:default="0">
+  <w:style w:type="paragraph" w:styleId="ListBullet">
     <w:name w:val="List Bullet"/>
     <w:basedOn w:val="Normal"/>
     <w:uiPriority w:val="99"/>
@@ -5450,7 +5458,7 @@
 </w:styles>
 </file>
 
-<file path=word/theme/theme1.xml><?xml version="1.0" encoding="UTF-8"?>
+<file path=word/theme/theme1.xml><?xml version="1.0" encoding="utf-8"?>
 <a:theme xmlns:a="http://schemas.openxmlformats.org/drawingml/2006/main" name="Integral">
   <a:themeElements>
     <a:clrScheme name="Integral">
@@ -5712,7 +5720,7 @@
   <a:extraClrSchemeLst/>
   <a:extLst>
     <a:ext uri="{05A4C25C-085E-4340-85A3-A5531E510DB2}">
-      <themeFamily xmlns="http://schemas.microsoft.com/office/thememl/2012/main" thm15:name="Integral" thm15:id="{3577F8C9-A904-41D8-97D2-FD898F53F20E}" thm15:vid="{682D6EBE-8D36-4FF2-9DB3-F3D8D7B6715D}"/>
+      <thm15:themeFamily xmlns:thm15="http://schemas.microsoft.com/office/thememl/2012/main" thm15:name="Integral" thm15:id="{3577F8C9-A904-41D8-97D2-FD898F53F20E}" thm15:vid="{682D6EBE-8D36-4FF2-9DB3-F3D8D7B6715D}"/>
     </a:ext>
   </a:extLst>
 </a:theme>

</xml_diff>